<commit_message>
fix(srt): DOCX = exact SRT copy (timestamps + cues)  codified rule + regen all
</commit_message>
<xml_diff>
--- a/docs/output/Zain Hajahjah/سجن البرج/SRT-En/أحمد الحاج عبد/DOCX/01_تفريغ عربي-الاعتقال_En.docx
+++ b/docs/output/Zain Hajahjah/سجن البرج/SRT-En/أحمد الحاج عبد/DOCX/01_تفريغ عربي-الاعتقال_En.docx
@@ -4,7 +4,28 @@
   <w:body>
     <w:p>
       <w:r>
+        <w:t>1</w:t>
+      </w:r>
+    </w:p>
+    <w:p>
+      <w:r>
+        <w:t>00:00:01,458 --&gt; 00:00:08,666</w:t>
+      </w:r>
+    </w:p>
+    <w:p>
+      <w:r>
         <w:t>Name: Ahmad al-Haj Abd, 27 years old, married</w:t>
+      </w:r>
+    </w:p>
+    <w:p/>
+    <w:p>
+      <w:r>
+        <w:t>2</w:t>
+      </w:r>
+    </w:p>
+    <w:p>
+      <w:r>
+        <w:t>00:00:11,875 --&gt; 00:00:15,041</w:t>
       </w:r>
     </w:p>
     <w:p>
@@ -12,9 +33,31 @@
         <w:t>I used to work in the private business sector</w:t>
       </w:r>
     </w:p>
+    <w:p/>
+    <w:p>
+      <w:r>
+        <w:t>3</w:t>
+      </w:r>
+    </w:p>
+    <w:p>
+      <w:r>
+        <w:t>00:00:17,708 --&gt; 00:00:20,791</w:t>
+      </w:r>
+    </w:p>
     <w:p>
       <w:r>
         <w:t>Interviewer: When were you arrested by ISIS?</w:t>
+      </w:r>
+    </w:p>
+    <w:p/>
+    <w:p>
+      <w:r>
+        <w:t>4</w:t>
+      </w:r>
+    </w:p>
+    <w:p>
+      <w:r>
+        <w:t>00:00:21,083 --&gt; 00:00:28,125</w:t>
       </w:r>
     </w:p>
     <w:p>
@@ -27,9 +70,31 @@
         <w:t>And what were the charges brought against you?</w:t>
       </w:r>
     </w:p>
+    <w:p/>
+    <w:p>
+      <w:r>
+        <w:t>5</w:t>
+      </w:r>
+    </w:p>
+    <w:p>
+      <w:r>
+        <w:t>00:00:28,333 --&gt; 00:00:34,875</w:t>
+      </w:r>
+    </w:p>
     <w:p>
       <w:r>
         <w:t>I was arrested in 2014, I don’t remember the exact month</w:t>
+      </w:r>
+    </w:p>
+    <w:p/>
+    <w:p>
+      <w:r>
+        <w:t>6</w:t>
+      </w:r>
+    </w:p>
+    <w:p>
+      <w:r>
+        <w:t>00:00:35,208 --&gt; 00:00:43,166</w:t>
       </w:r>
     </w:p>
     <w:p>
@@ -42,9 +107,31 @@
         <w:t>the charge was possession of a weapon</w:t>
       </w:r>
     </w:p>
+    <w:p/>
+    <w:p>
+      <w:r>
+        <w:t>7</w:t>
+      </w:r>
+    </w:p>
+    <w:p>
+      <w:r>
+        <w:t>00:00:43,625 --&gt; 00:00:47,083</w:t>
+      </w:r>
+    </w:p>
     <w:p>
       <w:r>
         <w:t>And also the charge of collaboration, something like that</w:t>
+      </w:r>
+    </w:p>
+    <w:p/>
+    <w:p>
+      <w:r>
+        <w:t>8</w:t>
+      </w:r>
+    </w:p>
+    <w:p>
+      <w:r>
+        <w:t>00:00:47,666 --&gt; 00:00:51,000</w:t>
       </w:r>
     </w:p>
     <w:p>
@@ -52,9 +139,31 @@
         <w:t>Interviewer: How many times were you detained by them?</w:t>
       </w:r>
     </w:p>
+    <w:p/>
+    <w:p>
+      <w:r>
+        <w:t>9</w:t>
+      </w:r>
+    </w:p>
+    <w:p>
+      <w:r>
+        <w:t>00:00:51,083 --&gt; 00:00:56,791</w:t>
+      </w:r>
+    </w:p>
     <w:p>
       <w:r>
         <w:t>Twice, the first time for one day, and the second time for 20 days</w:t>
+      </w:r>
+    </w:p>
+    <w:p/>
+    <w:p>
+      <w:r>
+        <w:t>10</w:t>
+      </w:r>
+    </w:p>
+    <w:p>
+      <w:r>
+        <w:t>00:00:58,750 --&gt; 00:01:03,625</w:t>
       </w:r>
     </w:p>
     <w:p>
@@ -67,6 +176,17 @@
         <w:t>you were arrested and brought to this place</w:t>
       </w:r>
     </w:p>
+    <w:p/>
+    <w:p>
+      <w:r>
+        <w:t>11</w:t>
+      </w:r>
+    </w:p>
+    <w:p>
+      <w:r>
+        <w:t>00:01:03,708 --&gt; 00:01:10,708</w:t>
+      </w:r>
+    </w:p>
     <w:p>
       <w:r>
         <w:t>Did you know that this place was a</w:t>
@@ -75,6 +195,17 @@
     <w:p>
       <w:r>
         <w:t>prison before? Describe this place for us</w:t>
+      </w:r>
+    </w:p>
+    <w:p/>
+    <w:p>
+      <w:r>
+        <w:t>12</w:t>
+      </w:r>
+    </w:p>
+    <w:p>
+      <w:r>
+        <w:t>00:01:10,958 --&gt; 00:01:16,208</w:t>
       </w:r>
     </w:p>
     <w:p>
@@ -87,9 +218,31 @@
         <w:t>Prison before, everyone knows it, it’s a well-known prison</w:t>
       </w:r>
     </w:p>
+    <w:p/>
+    <w:p>
+      <w:r>
+        <w:t>13</w:t>
+      </w:r>
+    </w:p>
+    <w:p>
+      <w:r>
+        <w:t>00:01:16,875 --&gt; 00:01:18,750</w:t>
+      </w:r>
+    </w:p>
     <w:p>
       <w:r>
         <w:t>But no one could know what was inside</w:t>
+      </w:r>
+    </w:p>
+    <w:p/>
+    <w:p>
+      <w:r>
+        <w:t>14</w:t>
+      </w:r>
+    </w:p>
+    <w:p>
+      <w:r>
+        <w:t>00:01:20,250 --&gt; 00:01:25,583</w:t>
       </w:r>
     </w:p>
     <w:p>
@@ -102,14 +255,47 @@
         <w:t>brought me in from the other side, from another door</w:t>
       </w:r>
     </w:p>
+    <w:p/>
+    <w:p>
+      <w:r>
+        <w:t>15</w:t>
+      </w:r>
+    </w:p>
+    <w:p>
+      <w:r>
+        <w:t>00:01:26,458 --&gt; 00:01:31,416</w:t>
+      </w:r>
+    </w:p>
     <w:p>
       <w:r>
         <w:t>Then they took us inside, to the solitary cells</w:t>
       </w:r>
     </w:p>
+    <w:p/>
+    <w:p>
+      <w:r>
+        <w:t>16</w:t>
+      </w:r>
+    </w:p>
+    <w:p>
+      <w:r>
+        <w:t>00:01:31,458 --&gt; 00:01:35,250</w:t>
+      </w:r>
+    </w:p>
     <w:p>
       <w:r>
         <w:t>Interviewer: What did you feel when you entered the prison?</w:t>
+      </w:r>
+    </w:p>
+    <w:p/>
+    <w:p>
+      <w:r>
+        <w:t>17</w:t>
+      </w:r>
+    </w:p>
+    <w:p>
+      <w:r>
+        <w:t>00:01:35,375 --&gt; 00:01:43,875</w:t>
       </w:r>
     </w:p>
     <w:p>
@@ -122,14 +308,47 @@
         <w:t>because I didn’t know what my charge was</w:t>
       </w:r>
     </w:p>
+    <w:p/>
+    <w:p>
+      <w:r>
+        <w:t>18</w:t>
+      </w:r>
+    </w:p>
+    <w:p>
+      <w:r>
+        <w:t>00:01:45,833 --&gt; 00:01:51,208</w:t>
+      </w:r>
+    </w:p>
     <w:p>
       <w:r>
         <w:t>They called me a collaborator, so honestly, I was very afraid</w:t>
       </w:r>
     </w:p>
+    <w:p/>
+    <w:p>
+      <w:r>
+        <w:t>19</w:t>
+      </w:r>
+    </w:p>
+    <w:p>
+      <w:r>
+        <w:t>00:01:51,541 --&gt; 00:01:53,875</w:t>
+      </w:r>
+    </w:p>
     <w:p>
       <w:r>
         <w:t>Of course, anyone who enters this place feels fear</w:t>
+      </w:r>
+    </w:p>
+    <w:p/>
+    <w:p>
+      <w:r>
+        <w:t>20</w:t>
+      </w:r>
+    </w:p>
+    <w:p>
+      <w:r>
+        <w:t>00:01:55,000 --&gt; 00:01:57,958</w:t>
       </w:r>
     </w:p>
     <w:p>
@@ -142,6 +361,17 @@
         <w:t>Witness: Eight</w:t>
       </w:r>
     </w:p>
+    <w:p/>
+    <w:p>
+      <w:r>
+        <w:t>21</w:t>
+      </w:r>
+    </w:p>
+    <w:p>
+      <w:r>
+        <w:t>00:02:02,208 --&gt; 00:02:05,875</w:t>
+      </w:r>
+    </w:p>
     <w:p>
       <w:r>
         <w:t>Interviewer: Were your hands cuffed</w:t>
@@ -150,6 +380,17 @@
     <w:p>
       <w:r>
         <w:t>or your eyes blindfolded? Explain more</w:t>
+      </w:r>
+    </w:p>
+    <w:p/>
+    <w:p>
+      <w:r>
+        <w:t>22</w:t>
+      </w:r>
+    </w:p>
+    <w:p>
+      <w:r>
+        <w:t>00:02:06,375 --&gt; 00:02:13,666</w:t>
       </w:r>
     </w:p>
     <w:p>
@@ -162,9 +403,31 @@
         <w:t>wasn’t blindfolded from the time they took me until this door</w:t>
       </w:r>
     </w:p>
+    <w:p/>
+    <w:p>
+      <w:r>
+        <w:t>23</w:t>
+      </w:r>
+    </w:p>
+    <w:p>
+      <w:r>
+        <w:t>00:02:13,791 --&gt; 00:02:20,500</w:t>
+      </w:r>
+    </w:p>
     <w:p>
       <w:r>
         <w:t>When I entered the solitary rooms, they blindfolded me when I went in</w:t>
+      </w:r>
+    </w:p>
+    <w:p/>
+    <w:p>
+      <w:r>
+        <w:t>24</w:t>
+      </w:r>
+    </w:p>
+    <w:p>
+      <w:r>
+        <w:t>00:02:21,000 --&gt; 00:02:24,083</w:t>
       </w:r>
     </w:p>
     <w:p>
@@ -172,9 +435,31 @@
         <w:t>They blindfolded me in that area, and there were eight people</w:t>
       </w:r>
     </w:p>
+    <w:p/>
+    <w:p>
+      <w:r>
+        <w:t>25</w:t>
+      </w:r>
+    </w:p>
+    <w:p>
+      <w:r>
+        <w:t>00:02:25,375 --&gt; 00:02:28,791</w:t>
+      </w:r>
+    </w:p>
     <w:p>
       <w:r>
         <w:t>They blindfolded me and took me inside, and they put me in the interrogation room</w:t>
+      </w:r>
+    </w:p>
+    <w:p/>
+    <w:p>
+      <w:r>
+        <w:t>26</w:t>
+      </w:r>
+    </w:p>
+    <w:p>
+      <w:r>
+        <w:t>00:02:30,166 --&gt; 00:02:35,541</w:t>
       </w:r>
     </w:p>
     <w:p>
@@ -182,9 +467,31 @@
         <w:t>Interviewer: What changes took place at the entrance of the Bourj Prison?</w:t>
       </w:r>
     </w:p>
+    <w:p/>
+    <w:p>
+      <w:r>
+        <w:t>27</w:t>
+      </w:r>
+    </w:p>
+    <w:p>
+      <w:r>
+        <w:t>00:02:35,666 --&gt; 00:02:39,833</w:t>
+      </w:r>
+    </w:p>
     <w:p>
       <w:r>
         <w:t>What was this place like before, and how has it become today?</w:t>
+      </w:r>
+    </w:p>
+    <w:p/>
+    <w:p>
+      <w:r>
+        <w:t>28</w:t>
+      </w:r>
+    </w:p>
+    <w:p>
+      <w:r>
+        <w:t>00:02:40,708 --&gt; 00:02:48,708</w:t>
       </w:r>
     </w:p>
     <w:p>
@@ -195,6 +502,17 @@
     <w:p>
       <w:r>
         <w:t>it didn’t have the destruction it has now</w:t>
+      </w:r>
+    </w:p>
+    <w:p/>
+    <w:p>
+      <w:r>
+        <w:t>29</w:t>
+      </w:r>
+    </w:p>
+    <w:p>
+      <w:r>
+        <w:t>00:02:50,083 --&gt; 00:02:57,416</w:t>
       </w:r>
     </w:p>
     <w:p>
@@ -575,9 +893,12 @@
     <w:name w:val="Normal"/>
     <w:qFormat/>
     <w:rsid w:val="00FC693F"/>
+    <w:pPr>
+      <w:spacing w:before="0" w:after="0" w:line="276" w:lineRule="auto"/>
+    </w:pPr>
     <w:rPr>
-      <w:rFonts w:ascii="Arial" w:hAnsi="Arial"/>
-      <w:sz w:val="22"/>
+      <w:rFonts w:ascii="Courier New" w:hAnsi="Courier New"/>
+      <w:sz w:val="20"/>
     </w:rPr>
   </w:style>
   <w:style w:type="paragraph" w:styleId="Header">

</xml_diff>